<commit_message>
Humanize report and add student info
Made-with: Cursor
</commit_message>
<xml_diff>
--- a/RAPOR.docx
+++ b/RAPOR.docx
@@ -7,7 +7,23 @@
         <w:pStyle w:val="Heading1"/>
       </w:pPr>
       <w:r>
-        <w:t>Akıllı Asansör Trafiği Simülasyonu (Streamlit + SimPy) — Vize Raporu</w:t>
+        <w:t>Akıllı Asansör Trafiği Simülasyonu — Vize Raporu</w:t>
+      </w:r>
+    </w:p>
+    <w:p/>
+    <w:p>
+      <w:r>
+        <w:t>Ad Soyad: Barış Çevik</w:t>
+      </w:r>
+    </w:p>
+    <w:p>
+      <w:r>
+        <w:t>Öğrenci No: 22439970008</w:t>
+      </w:r>
+    </w:p>
+    <w:p>
+      <w:r>
+        <w:t>Ders: Benzetim Programları</w:t>
       </w:r>
     </w:p>
     <w:p/>
@@ -21,25 +37,7 @@
     </w:p>
     <w:p>
       <w:r>
-        <w:t xml:space="preserve">Çok katlı binalarda yoğun saatlerde (sabah giriş, öğle, akşam çıkış) </w:t>
-      </w:r>
-      <w:r>
-        <w:rPr>
-          <w:b/>
-        </w:rPr>
-        <w:t>asansör bekleme süreleri artar</w:t>
-      </w:r>
-      <w:r>
-        <w:t xml:space="preserve">, katlarda kuyruk birikir ve kapasite yetersizliği yaşanır. Bu proje, </w:t>
-      </w:r>
-      <w:r>
-        <w:rPr>
-          <w:b/>
-        </w:rPr>
-        <w:t>asansör sayısı / kapasitesi / hız / kontrol stratejisi</w:t>
-      </w:r>
-      <w:r>
-        <w:t xml:space="preserve"> gibi parametrelerin;</w:t>
+        <w:t>Çok katlı binalarda yoğun saatlerde (sabah giriş, öğle, akşam çıkış) asansör bekleme süreleri artar, katlarda kuyruk birikir ve kapasite yetersizliği yaşanır. Bu projede, asansör sayısı/kapasitesi/hızı ve basit kontrol stratejilerinin;</w:t>
       </w:r>
     </w:p>
     <w:p/>
@@ -70,16 +68,7 @@
     <w:p/>
     <w:p>
       <w:r>
-        <w:t xml:space="preserve">etkisini </w:t>
-      </w:r>
-      <w:r>
-        <w:rPr>
-          <w:b/>
-        </w:rPr>
-        <w:t>ayrık olay simülasyonu</w:t>
-      </w:r>
-      <w:r>
-        <w:t xml:space="preserve"> ile incelemeyi amaçlar.</w:t>
+        <w:t>etkisi ayrık olay simülasyonu ile incelenecektir.</w:t>
       </w:r>
     </w:p>
     <w:p/>
@@ -93,16 +82,7 @@
     </w:p>
     <w:p>
       <w:r>
-        <w:t xml:space="preserve">Vize tesliminde, gerçek bir veri seti yerine </w:t>
-      </w:r>
-      <w:r>
-        <w:rPr>
-          <w:b/>
-        </w:rPr>
-        <w:t>sentetik (simülasyon tabanlı) talep verisi</w:t>
-      </w:r>
-      <w:r>
-        <w:t xml:space="preserve"> kullanılacaktır:</w:t>
+        <w:t>Vize tesliminde, gerçek bir veri seti yerine simülasyonun ürettiği talep verisi kullanılacaktır:</w:t>
       </w:r>
     </w:p>
     <w:p/>
@@ -172,13 +152,7 @@
         <w:pStyle w:val="ListBullet"/>
       </w:pPr>
       <w:r>
-        <w:rPr>
-          <w:b/>
-        </w:rPr>
-        <w:t>SimPy</w:t>
-      </w:r>
-      <w:r>
-        <w:t>: ayrık olay simülasyonu (yolcu süreçleri, asansör süreçleri, kuyruklar)</w:t>
+        <w:t>SimPy: ayrık olay simülasyonu (yolcu süreçleri, asansör süreçleri, kuyruklar)</w:t>
       </w:r>
     </w:p>
     <w:p>
@@ -186,13 +160,7 @@
         <w:pStyle w:val="ListBullet"/>
       </w:pPr>
       <w:r>
-        <w:rPr>
-          <w:b/>
-        </w:rPr>
-        <w:t>Streamlit</w:t>
-      </w:r>
-      <w:r>
-        <w:t>: arayüz (parametre seçimi, simülasyonu çalıştırma, rapor/çıktı gösterimi)</w:t>
+        <w:t>Streamlit: arayüz (parametre seçimi, simülasyonu çalıştırma, çıktı gösterimi)</w:t>
       </w:r>
     </w:p>
     <w:p>
@@ -200,13 +168,7 @@
         <w:pStyle w:val="ListBullet"/>
       </w:pPr>
       <w:r>
-        <w:rPr>
-          <w:b/>
-        </w:rPr>
-        <w:t>Pandas / NumPy</w:t>
-      </w:r>
-      <w:r>
-        <w:t>: çıktıların tabloya dökülmesi ve özet istatistikler</w:t>
+        <w:t>Pandas / NumPy: çıktıların tabloya dökülmesi ve özet istatistikler</w:t>
       </w:r>
     </w:p>
     <w:p>
@@ -214,13 +176,7 @@
         <w:pStyle w:val="ListBullet"/>
       </w:pPr>
       <w:r>
-        <w:rPr>
-          <w:b/>
-        </w:rPr>
-        <w:t>Plotly</w:t>
-      </w:r>
-      <w:r>
-        <w:t>: grafikler (zaman serisi, ısı haritası vb.)</w:t>
+        <w:t>Plotly: grafikler (zaman serisi, ısı haritası vb.)</w:t>
       </w:r>
     </w:p>
     <w:p/>
@@ -310,16 +266,7 @@
     </w:p>
     <w:p>
       <w:r>
-        <w:t xml:space="preserve">Arayüz </w:t>
-      </w:r>
-      <w:r>
-        <w:rPr>
-          <w:b/>
-        </w:rPr>
-        <w:t>Streamlit</w:t>
-      </w:r>
-      <w:r>
-        <w:t xml:space="preserve"> ile web tabanlı geliştirilecektir.</w:t>
+        <w:t>Arayüz Streamlit ile web tabanlı geliştirilecektir.</w:t>
       </w:r>
     </w:p>
     <w:p/>
@@ -371,13 +318,7 @@
         <w:pStyle w:val="ListBullet"/>
       </w:pPr>
       <w:r>
-        <w:rPr>
-          <w:b/>
-        </w:rPr>
-        <w:t>Isı haritası (heatmap)</w:t>
-      </w:r>
-      <w:r>
-        <w:t>: zaman dilimlerine göre kat bazında ortalama kuyruk yoğunluğu</w:t>
+        <w:t>Isı haritası: zaman dilimlerine göre kat bazında ortalama kuyruk yoğunluğu</w:t>
       </w:r>
     </w:p>
     <w:p>
@@ -385,13 +326,7 @@
         <w:pStyle w:val="ListBullet"/>
       </w:pPr>
       <w:r>
-        <w:rPr>
-          <w:b/>
-        </w:rPr>
-        <w:t>Zaman serisi grafikleri</w:t>
-      </w:r>
-      <w:r>
-        <w:t>: toplam kuyruk uzunluğu ve bekleme metrikleri</w:t>
+        <w:t>Zaman serisi grafikleri: toplam kuyruk uzunluğu ve bekleme metrikleri</w:t>
       </w:r>
     </w:p>
     <w:p/>
@@ -436,13 +371,7 @@
         <w:pStyle w:val="ListBullet"/>
       </w:pPr>
       <w:r>
-        <w:t xml:space="preserve">Repo linki: </w:t>
-      </w:r>
-      <w:r>
-        <w:rPr>
-          <w:b/>
-        </w:rPr>
-        <w:t>https://github.com/bariscevk1/akilli-asansor-simpy-streamlit</w:t>
+        <w:t>Repo linki: https://github.com/bariscevk1/akilli-asansor-simpy-streamlit</w:t>
       </w:r>
     </w:p>
     <w:p/>

</xml_diff>

<commit_message>
Update report: add sources and remove run section
Made-with: Cursor
</commit_message>
<xml_diff>
--- a/RAPOR.docx
+++ b/RAPOR.docx
@@ -430,35 +430,73 @@
         <w:pStyle w:val="Heading2"/>
       </w:pPr>
       <w:r>
-        <w:t>Ek: Çalıştırma (vize sürümü)</w:t>
+        <w:t>7) Kaynaklar</w:t>
       </w:r>
     </w:p>
     <w:p>
+      <w:pPr>
+        <w:pStyle w:val="ListBullet"/>
+      </w:pPr>
       <w:r>
-        <w:t xml:space="preserve">Projede </w:t>
-      </w:r>
-      <w:r>
-        <w:rPr>
-          <w:rFonts w:ascii="Consolas" w:hAnsi="Consolas"/>
-        </w:rPr>
-        <w:t>requirements.txt</w:t>
-      </w:r>
-      <w:r>
-        <w:t xml:space="preserve"> bulunmaktadır. Kurulum ve çalıştırma:</w:t>
+        <w:t>SimPy Documentation: https://simpy.readthedocs.io/</w:t>
       </w:r>
     </w:p>
-    <w:p/>
     <w:p>
+      <w:pPr>
+        <w:pStyle w:val="ListBullet"/>
+      </w:pPr>
       <w:r>
-        <w:rPr>
-          <w:rFonts w:ascii="Consolas" w:hAnsi="Consolas"/>
-        </w:rPr>
-        <w:t>pip install -r requirements.txt</w:t>
-        <w:br/>
-        <w:t>streamlit run app.py</w:t>
+        <w:t>Streamlit Documentation: https://docs.streamlit.io/</w:t>
       </w:r>
     </w:p>
-    <w:p/>
+    <w:p>
+      <w:pPr>
+        <w:pStyle w:val="ListBullet"/>
+      </w:pPr>
+      <w:r>
+        <w:t>Plotly Python Documentation: https://plotly.com/python/</w:t>
+      </w:r>
+    </w:p>
+    <w:p>
+      <w:pPr>
+        <w:pStyle w:val="ListBullet"/>
+      </w:pPr>
+      <w:r>
+        <w:t>pandas Documentation: https://pandas.pydata.org/docs/</w:t>
+      </w:r>
+    </w:p>
+    <w:p>
+      <w:pPr>
+        <w:pStyle w:val="ListBullet"/>
+      </w:pPr>
+      <w:r>
+        <w:t>NumPy Documentation: https://numpy.org/doc/</w:t>
+      </w:r>
+    </w:p>
+    <w:p>
+      <w:pPr>
+        <w:pStyle w:val="ListBullet"/>
+      </w:pPr>
+      <w:r>
+        <w:t>python-docx Documentation: https://python-docx.readthedocs.io/</w:t>
+      </w:r>
+    </w:p>
+    <w:p>
+      <w:pPr>
+        <w:pStyle w:val="ListBullet"/>
+      </w:pPr>
+      <w:r>
+        <w:t>qrcode (Python) Package: https://pypi.org/project/qrcode/</w:t>
+      </w:r>
+    </w:p>
+    <w:p>
+      <w:pPr>
+        <w:pStyle w:val="ListBullet"/>
+      </w:pPr>
+      <w:r>
+        <w:t>GitHub CLI Documentation: https://cli.github.com/manual/</w:t>
+      </w:r>
+    </w:p>
     <w:sectPr>
       <w:pgSz w:w="12240" w:h="15840"/>
       <w:pgMar w:top="1440" w:right="1800" w:bottom="1440" w:left="1800" w:header="720" w:footer="720" w:gutter="0"/>

</xml_diff>

<commit_message>
Update report: remove placeholder repo sentence
Made-with: Cursor
</commit_message>
<xml_diff>
--- a/RAPOR.docx
+++ b/RAPOR.docx
@@ -361,12 +361,6 @@
       </w:r>
     </w:p>
     <w:p>
-      <w:r>
-        <w:t>GitHub deposu vize tesliminde boş/iskelet olarak açılacak ve finalde tamamlanacaktır.</w:t>
-      </w:r>
-    </w:p>
-    <w:p/>
-    <w:p>
       <w:pPr>
         <w:pStyle w:val="ListBullet"/>
       </w:pPr>

</xml_diff>